<commit_message>
Rebuild the one-pager Word copy against v1.3
My previous commit staged the v1.3 rewrite of 00-ONE-PAGE-BRIEF.md -- which had
landed on disk from the drafting pass while I was editing the hold banner --
next to a .docx built from the version before it. verify_docx.py run against
the pushed tree caught it: 1,527 word-level differences, and the Word copy
still carried "General fund cost: $0" and "$13M-$182M" after the Markdown had
dropped both. Exactly the failure the verifier exists to catch, on exactly the
file that gets forwarded.

Rebuilt and re-verified: 1,306 words and 109 figures matched. Still one letter
page at 93.7% fill. v1.3's own PRINT STATUS banner supersedes the hold banner I
had written, and is the better record -- it marks both print-blocking defects
fixed and leaves clearance to the Policy Director.

Co-Authored-By: Claude Opus 5 <noreply@anthropic.com>
</commit_message>
<xml_diff>
--- a/briefs/2027-military-service-credit-cost-window/00-ONE-PAGE-BRIEF.docx
+++ b/briefs/2027-military-service-credit-cost-window/00-ONE-PAGE-BRIEF.docx
@@ -7,7 +7,7 @@
         <w:pStyle w:val="Heading1"/>
       </w:pPr>
       <w:r>
-        <w:t>Let veteran state employees buy their military retirement credit at a fair price</w:t>
+        <w:t>JLC Initiative</w:t>
       </w:r>
     </w:p>
     <w:p>
@@ -18,7 +18,7 @@
         <w:t>Joint Leadership Council of Veterans Service Organizations — 2027 Session</w:t>
       </w:r>
       <w:r>
-        <w:t xml:space="preserve"> One sentence, in one Code section: </w:t>
+        <w:t xml:space="preserve"> Military service credit for veteran public employees — state, school division and local. One change, in one Code section: </w:t>
       </w:r>
       <w:r>
         <w:rPr>
@@ -27,13 +27,7 @@
         <w:t>§ 51.1-142.2</w:t>
       </w:r>
       <w:r>
-        <w:t xml:space="preserve">. </w:t>
-      </w:r>
-      <w:r>
-        <w:rPr>
-          <w:b/>
-        </w:rPr>
-        <w:t>General fund cost: $0.</w:t>
+        <w:t>.</w:t>
       </w:r>
     </w:p>
     <w:p>
@@ -46,16 +40,25 @@
     </w:p>
     <w:p>
       <w:r>
-        <w:t xml:space="preserve">Amend the Virginia Retirement System so a veteran who works for Virginia can buy up to four years of military service credit at the regular price </w:t>
+        <w:t xml:space="preserve">Amend the Virginia Retirement System to allow </w:t>
       </w:r>
       <w:r>
         <w:rPr>
           <w:b/>
         </w:rPr>
-        <w:t>at any point in their career</w:t>
+        <w:t>any veteran who works for Virginia</w:t>
       </w:r>
       <w:r>
-        <w:t xml:space="preserve"> — not only in their first two years on the job.</w:t>
+        <w:t xml:space="preserve"> — for a state agency, a school division, a city, a county or a town — </w:t>
+      </w:r>
+      <w:r>
+        <w:rPr>
+          <w:b/>
+        </w:rPr>
+        <w:t>to be eligible to buy up to four years of their active duty military service at the regular price at any point in their career</w:t>
+      </w:r>
+      <w:r>
+        <w:t>, instead of only during their first 24 months on the job.</w:t>
       </w:r>
     </w:p>
     <w:p>
@@ -68,16 +71,31 @@
     </w:p>
     <w:p>
       <w:r>
-        <w:t xml:space="preserve">Veterans on the state payroll may </w:t>
+        <w:rPr>
+          <w:b/>
+        </w:rPr>
+        <w:t>The law today.</w:t>
+      </w:r>
+      <w:r>
+        <w:t xml:space="preserve"> A veteran has </w:t>
       </w:r>
       <w:r>
         <w:rPr>
           <w:b/>
         </w:rPr>
-        <w:t>already</w:t>
+        <w:t>24 months from hire</w:t>
       </w:r>
       <w:r>
-        <w:t xml:space="preserve"> buy up to four years of their military service toward their VRS pension. The price is a flat percentage of salary, set by the VRS Board.</w:t>
+        <w:t xml:space="preserve"> to buy up to four years of active duty military service at </w:t>
+      </w:r>
+      <w:r>
+        <w:rPr>
+          <w:b/>
+        </w:rPr>
+        <w:t>approximate normal cost</w:t>
+      </w:r>
+      <w:r>
+        <w:t xml:space="preserve"> — the regular published price. After 24 months, the same four years are repriced to "actuarial equivalent cost," which is far higher.</w:t>
       </w:r>
     </w:p>
     <w:p>
@@ -85,15 +103,21 @@
         <w:rPr>
           <w:b/>
         </w:rPr>
-        <w:t>But that price expires 24 months after their first day of work.</w:t>
+        <w:t>We ask that the regular price stay available for the veteran's whole career.</w:t>
       </w:r>
       <w:r>
-        <w:t xml:space="preserve"> After that, the same four years costs far more.</w:t>
+        <w:t xml:space="preserve"> Nothing else changes — same four-year limit, same proof of service, same rules on who may buy.</w:t>
       </w:r>
     </w:p>
     <w:p>
       <w:r>
-        <w:t>Three reasons that deadline is the wrong deadline:</w:t>
+        <w:rPr>
+          <w:b/>
+        </w:rPr>
+        <w:t>Why. The inequity is this:</w:t>
+      </w:r>
+      <w:r>
+        <w:t xml:space="preserve"> two veterans, same military service, same job, two different prices. The only difference is how long they have worked for Virginia. The deadline lands in the wrong place for three reasons:</w:t>
       </w:r>
     </w:p>
     <w:p>
@@ -104,10 +128,10 @@
         <w:rPr>
           <w:b/>
         </w:rPr>
-        <w:t>It hits at the worst possible time.</w:t>
+        <w:t>It falls at the worst time to pay.</w:t>
       </w:r>
       <w:r>
-        <w:t xml:space="preserve"> Four years of credit costs about </w:t>
+        <w:t xml:space="preserve"> Four years costs about </w:t>
       </w:r>
       <w:r>
         <w:rPr>
@@ -125,7 +149,7 @@
         <w:t>37.7 years old</w:t>
       </w:r>
       <w:r>
-        <w:t xml:space="preserve"> — just out of uniform, often taking a pay cut, and at the bottom of the state pay scale.</w:t>
+        <w:t xml:space="preserve"> — recently out of uniform, often taking a pay cut, at the bottom of the pay scale.</w:t>
       </w:r>
     </w:p>
     <w:p>
@@ -136,10 +160,10 @@
         <w:rPr>
           <w:b/>
         </w:rPr>
-        <w:t>They cannot pay it off slowly.</w:t>
+        <w:t>It cannot be paid off slowly.</w:t>
       </w:r>
       <w:r>
-        <w:t xml:space="preserve"> VRS payment plans run 6 to 12 months and cannot extend past the two-year deadline. Pay fast, or lose the price for good.</w:t>
+        <w:t xml:space="preserve"> VRS payment plans run 6 to 12 months and cannot run past the 24-month deadline. Pay fast, or lose the price for good.</w:t>
       </w:r>
     </w:p>
     <w:p>
@@ -150,7 +174,7 @@
         <w:rPr>
           <w:b/>
         </w:rPr>
-        <w:t>Most never hear about it in time.</w:t>
+        <w:t>Most veterans never hear about it in time.</w:t>
       </w:r>
       <w:r>
         <w:t xml:space="preserve"> It is one line in a long statute, explained on day one with the rest of the new-hire paperwork. The average state employee stays </w:t>
@@ -170,39 +194,28 @@
         <w:rPr>
           <w:b/>
         </w:rPr>
-        <w:t>The result:</w:t>
+        <w:t>How many people.</w:t>
       </w:r>
       <w:r>
-        <w:t xml:space="preserve"> a veteran with eight years of state service pays dramatically more for the same four years of military credit than the brand-new hire down the hall. Same service to the country, same credit, different price — and the only difference is how long they have worked for Virginia.</w:t>
-      </w:r>
-    </w:p>
-    <w:p>
-      <w:r>
-        <w:rPr>
-          <w:b/>
-        </w:rPr>
-        <w:t>Who it helps:</w:t>
-      </w:r>
-      <w:r>
-        <w:t xml:space="preserve"> every veteran in VRS — state employees, teachers, and local government employees. </w:t>
+        <w:t xml:space="preserve"> </w:t>
       </w:r>
       <w:r>
         <w:rPr>
           <w:b/>
         </w:rPr>
-        <w:t>All 110,474 active Plan 1 members are already past the deadline as a matter of law.</w:t>
+        <w:t>All 110,474 active Plan 1 members are already past the deadline as a matter of law</w:t>
       </w:r>
       <w:r>
-        <w:t xml:space="preserve"> Across all three plans, an estimated </w:t>
+        <w:t xml:space="preserve"> — 29% of everyone under VRS. Across all three plans, an estimated </w:t>
       </w:r>
       <w:r>
         <w:rPr>
           <w:b/>
         </w:rPr>
-        <w:t>10,600 to 26,300</w:t>
+        <w:t>11,600 to 24,000</w:t>
       </w:r>
       <w:r>
-        <w:t xml:space="preserve"> veterans hold military service they could still buy.</w:t>
+        <w:t xml:space="preserve"> veterans hold service they could still buy — a ceiling, because § 51.1-142.2 B 3 already bars a veteran whose service counts toward a military retirement they draw.</w:t>
       </w:r>
     </w:p>
     <w:p>
@@ -218,10 +231,34 @@
         <w:rPr>
           <w:b/>
         </w:rPr>
-        <w:t>General fund cost: $0.</w:t>
+        <w:t>This bill requests no appropriation.</w:t>
       </w:r>
       <w:r>
-        <w:t xml:space="preserve"> That is structural, not a rounding. This is an employer-contribution-rate liability, amortised under the VRS Funding Policy the way VRS absorbs every other liability. No appropriation is requested.</w:t>
+        <w:t xml:space="preserve"> There is no 2027 general fund ask. The cost is absorbed in the employer contribution rates the VRS Board certifies under </w:t>
+      </w:r>
+      <w:r>
+        <w:rPr>
+          <w:b/>
+        </w:rPr>
+        <w:t>§ 51.1-145</w:t>
+      </w:r>
+      <w:r>
+        <w:t xml:space="preserve">. For state agencies, and for the Commonwealth's share of teacher rates, those contributions are carried in a </w:t>
+      </w:r>
+      <w:r>
+        <w:rPr>
+          <w:b/>
+        </w:rPr>
+        <w:t>future</w:t>
+      </w:r>
+      <w:r>
+        <w:t xml:space="preserve"> appropriation act — and </w:t>
+      </w:r>
+      <w:r>
+        <w:rPr>
+          <w:b/>
+        </w:rPr>
+        <w:t>school divisions and local governments pay their own VRS rates on the same basis.</w:t>
       </w:r>
     </w:p>
     <w:p>
@@ -229,19 +266,46 @@
         <w:rPr>
           <w:b/>
         </w:rPr>
-        <w:t>The pension liability is real: a one-time present value of $13 million to $182 million</w:t>
+        <w:t>The cost is real, and most of it is retirements arriving earlier.</w:t>
       </w:r>
       <w:r>
-        <w:t xml:space="preserve"> — 5 to 68 cents out of every $100 of VRS covered payroll ($26.8 billion). The range is wide for one reason: </w:t>
+        <w:t xml:space="preserve"> Buying credit raises the member's monthly pension a little. It also moves the date they can retire unreduced </w:t>
       </w:r>
       <w:r>
         <w:rPr>
           <w:b/>
         </w:rPr>
-        <w:t>nobody outside VRS knows how many veterans will actually buy.</w:t>
+        <w:t>earlier</w:t>
       </w:r>
       <w:r>
-        <w:t xml:space="preserve"> Members must fund these purchases out of their own pay, so take-up is historically low. VRS holds that data and JLCVSO has formally asked for it.</w:t>
+        <w:t xml:space="preserve">, and that is the larger half of the bill — new retirees, sooner. Modelled one-time cost to the Fund: </w:t>
+      </w:r>
+      <w:r>
+        <w:rPr>
+          <w:b/>
+        </w:rPr>
+        <w:t>$28 million to $166 million</w:t>
+      </w:r>
+      <w:r>
+        <w:t xml:space="preserve">. Spread over 20 years, that is </w:t>
+      </w:r>
+      <w:r>
+        <w:rPr>
+          <w:b/>
+        </w:rPr>
+        <w:t>about 1 to 4 cents per $100 of payroll per year</w:t>
+      </w:r>
+      <w:r>
+        <w:t xml:space="preserve">, against employer rates that run </w:t>
+      </w:r>
+      <w:r>
+        <w:rPr>
+          <w:b/>
+        </w:rPr>
+        <w:t>14% to 20%</w:t>
+      </w:r>
+      <w:r>
+        <w:t xml:space="preserve"> today.</w:t>
       </w:r>
     </w:p>
     <w:p>
@@ -249,46 +313,10 @@
         <w:rPr>
           <w:b/>
         </w:rPr>
-        <w:t>For scale, VRS has already priced a more generous bill.</w:t>
+        <w:t>The range is wide for one reason: nobody outside VRS knows how many veterans will buy.</w:t>
       </w:r>
       <w:r>
-        <w:t xml:space="preserve"> HB 1867 (2023) would have given teachers this same service </w:t>
-      </w:r>
-      <w:r>
-        <w:rPr>
-          <w:b/>
-        </w:rPr>
-        <w:t>free</w:t>
-      </w:r>
-      <w:r>
-        <w:t xml:space="preserve">; VRS's own impact statement found </w:t>
-      </w:r>
-      <w:r>
-        <w:rPr>
-          <w:b/>
-        </w:rPr>
-        <w:t>$10,000 to $60,000</w:t>
-      </w:r>
-      <w:r>
-        <w:t xml:space="preserve"> of unfunded liability per participating member. Our veterans still pay — so this bill costs the Fund </w:t>
-      </w:r>
-      <w:r>
-        <w:rPr>
-          <w:b/>
-        </w:rPr>
-        <w:t>less per member</w:t>
-      </w:r>
-      <w:r>
-        <w:t xml:space="preserve"> than the one VRS already scored: </w:t>
-      </w:r>
-      <w:r>
-        <w:rPr>
-          <w:b/>
-        </w:rPr>
-        <w:t>$6,800 to $48,000</w:t>
-      </w:r>
-      <w:r>
-        <w:t>, depending on plan.</w:t>
+        <w:t xml:space="preserve"> Members pay from their own pockets, so take-up is normally low — but this bill removes the three things holding it down, so past experience understates it. JLCVSO has asked VRS for that data.</w:t>
       </w:r>
     </w:p>
     <w:p>
@@ -296,28 +324,37 @@
         <w:rPr>
           <w:b/>
         </w:rPr>
-        <w:t>Why the per-member cost stays modest:</w:t>
+        <w:t>The cost per veteran falls on its own.</w:t>
       </w:r>
       <w:r>
-        <w:t xml:space="preserve"> below about </w:t>
+        <w:t xml:space="preserve"> It is </w:t>
       </w:r>
       <w:r>
         <w:rPr>
           <w:b/>
         </w:rPr>
-        <w:t>age 47–48</w:t>
+        <w:t>$47,967</w:t>
       </w:r>
       <w:r>
-        <w:t xml:space="preserve"> a veteran buying at the regular rate pays </w:t>
+        <w:t xml:space="preserve"> for a Plan 1 member and </w:t>
       </w:r>
       <w:r>
         <w:rPr>
-          <w:i/>
+          <w:b/>
         </w:rPr>
-        <w:t>more</w:t>
+        <w:t>$6,779</w:t>
       </w:r>
       <w:r>
-        <w:t xml:space="preserve"> than the credit is actuarially worth, and the average new state hire is 37.7. Everyone hired since 2014 is in the Hybrid plan, where a year of credit is worth 1% of pay — so the regular price nearly covers its real cost.</w:t>
+        <w:t xml:space="preserve"> for a Hybrid member. Hybrid is 53% of the workforce today and </w:t>
+      </w:r>
+      <w:r>
+        <w:rPr>
+          <w:b/>
+        </w:rPr>
+        <w:t>100% of future hires</w:t>
+      </w:r>
+      <w:r>
+        <w:t>, so this bill gets cheaper every year with no further legislation.</w:t>
       </w:r>
     </w:p>
     <w:p>
@@ -331,7 +368,7 @@
           <w:color w:val="444444"/>
           <w:sz w:val="17"/>
         </w:rPr>
-        <w:t xml:space="preserve">These are JLCVSO analyst estimates from published VRS rates, covering all VRS members — </w:t>
+        <w:t xml:space="preserve">JLCVSO analyst estimates from published VRS rates — </w:t>
       </w:r>
       <w:r>
         <w:rPr>
@@ -348,7 +385,7 @@
           <w:color w:val="444444"/>
           <w:sz w:val="17"/>
         </w:rPr>
-        <w:t xml:space="preserve">. VRS must file an official impact statement on any VRS bill (§ 30-19.1:7). JLCVSO should ask VRS for its number </w:t>
+        <w:t xml:space="preserve">. VRS must file its own statement on any VRS bill (§ 30-19.1:7); on a comparable 2023 bill it reported $10,000 to $60,000 per member. </w:t>
       </w:r>
       <w:r>
         <w:rPr>
@@ -357,15 +394,7 @@
           <w:color w:val="444444"/>
           <w:sz w:val="17"/>
         </w:rPr>
-        <w:t>before</w:t>
-      </w:r>
-      <w:r>
-        <w:rPr>
-          <w:i/>
-          <w:color w:val="444444"/>
-          <w:sz w:val="17"/>
-        </w:rPr>
-        <w:t xml:space="preserve"> the bill is filed.</w:t>
+        <w:t>Ask VRS for its number before this bill is filed.</w:t>
       </w:r>
     </w:p>
     <w:p>
@@ -400,7 +429,7 @@
         <w:rPr>
           <w:b/>
         </w:rPr>
-        <w:t>Drop the two-year price deadline for military service only.</w:t>
+        <w:t>Remove the 24-month price deadline for military service only.</w:t>
       </w:r>
       <w:r>
         <w:t xml:space="preserve"> Leave it in place for every other kind of purchased service, so the bill stays narrow.</w:t>
@@ -422,7 +451,7 @@
         <w:rPr>
           <w:b/>
         </w:rPr>
-        <w:t>Let veterans pay over up to 60 months</w:t>
+        <w:t>Allow payment over up to 60 months</w:t>
       </w:r>
       <w:r>
         <w:t xml:space="preserve"> by payroll deduction.</w:t>
@@ -456,12 +485,18 @@
         <w:t>age and length of service</w:t>
       </w:r>
       <w:r>
-        <w:t>, and authority to require the purchase be finished 12 months before retirement. These stop last-minute buying.</w:t>
+        <w:t>, and authority to withhold the credit where the member retires within 12 months of buying it. These stop last-minute buying.</w:t>
       </w:r>
     </w:p>
     <w:p>
       <w:r>
-        <w:t>No regulation change is needed — the price rule is in the statute, so this takes a bill.</w:t>
+        <w:rPr>
+          <w:b/>
+        </w:rPr>
+        <w:t>No regulation change is needed.</w:t>
+      </w:r>
+      <w:r>
+        <w:t xml:space="preserve"> The price rule is written into the statute, so this takes a bill.</w:t>
       </w:r>
     </w:p>
     <w:p>
@@ -469,7 +504,7 @@
         <w:rPr>
           <w:i/>
         </w:rPr>
-        <w:t xml:space="preserve">Draft bill text: </w:t>
+        <w:t xml:space="preserve">Bill text: </w:t>
       </w:r>
       <w:r>
         <w:rPr>
@@ -481,7 +516,7 @@
         <w:rPr>
           <w:i/>
         </w:rPr>
-        <w:t xml:space="preserve">. Cost assumptions and sources: </w:t>
+        <w:t xml:space="preserve">. Cost sources: </w:t>
       </w:r>
       <w:r>
         <w:rPr>
@@ -493,7 +528,7 @@
         <w:rPr>
           <w:i/>
         </w:rPr>
-        <w:t xml:space="preserve"> and </w:t>
+        <w:t xml:space="preserve">, </w:t>
       </w:r>
       <w:r>
         <w:rPr>
@@ -505,19 +540,19 @@
         <w:rPr>
           <w:i/>
         </w:rPr>
-        <w:t xml:space="preserve">. Full brief with all citations: </w:t>
+        <w:t xml:space="preserve">. Full brief: </w:t>
       </w:r>
       <w:r>
         <w:rPr>
           <w:i/>
         </w:rPr>
-        <w:t>01-JLC-Legislative-Change-Brief</w:t>
+        <w:t>01</w:t>
       </w:r>
       <w:r>
         <w:rPr>
           <w:i/>
         </w:rPr>
-        <w:t xml:space="preserve"> (v1.2).</w:t>
+        <w:t>.</w:t>
       </w:r>
     </w:p>
     <w:p>
@@ -529,7 +564,7 @@
           <w:vanish/>
           <w:sz w:val="15"/>
         </w:rPr>
-        <w:t>[Source provenance, hidden text — not printed. Reveal with Word's Show/Hide formatting marks.] HOLD RE-IMPOSED — October 25, 2026, on the lead attorney's sign-off. DO NOT PRINT, DISTRIBUTE OR LEAVE BEHIND THIS VERSION. The hold was lifted earlier the same day once the board accepted Option C of the MOO-293 framing decision (plan document revision 1). That decision settled the FRAMING and still stands. What the board was not asked about, because it had not been recorded yet, is the red team verdict at 05-Red-Team-Review.md, which rates two findings fatal and says in terms: do not file, and pull the one-pager back off print, until F-1 and F-2 are resolved. Two defects in the body copy below: 1. F-2 (fatal). "General fund cost: $0. That is structural, not a rounding" is contradicted by this package's own who-bears table, which books $20M-$40M of present value on state agencies as general fund AND nongeneral fund, and $13M-$33M on school divisions through the Standards of Quality. Annex B F-61 reaches the same conclusion from VRS's own HB 1867 statement, which says "no IMMEDIATE impact" and, beside it, that contribution rates may move over time. The defensible claim is narrower and still wins: this bill requests no appropriation; the cost is absorbed in the employer contribution rates the Board certifies under Sec. 51.1-145. School divisions and localities must be named as cost-bearers. Replacement language is drafted at 05 F-2. 2. The range is out of date. "$13M-$182M" takes its floor from the 5% take-up row, which belongs to the superseded v1.1 band, and its ceiling from the current 30% row -- one range built from two assumption sets. On the current scenario set, Annex B v2.1 A-22 puts the range to publish at $26M-$182M. Resolving both is a drafting job against a fixed one-page budget, not a banner edit; it is tracked as its own issue. 00-ONE-PAGE-BRIEF.html and 00-ONE-PAGE-BRIEF.pdf carry the same two defects and are on the same hold. Superseded and NOT to be quoted: "under $2 million one time," "under $100,000 a year," "about 5 cents out of every $100" as a ceiling, and now "$13M-$182M" and "General fund cost: $0."</w:t>
+        <w:t>[Source provenance, hidden text — not printed. Reveal with Word's Show/Hide formatting marks.] v1.3 — October 25, 2026. Restructured to the JLC Initiative format the board specified: JLC Initiative / OBJECTIVE / DISCUSSION / COST / RECOMMENDATION, in plain English for delegates, senators and staff. PRINT STATUS: the two print-blocking copy defects are now FIXED here. Clearance to print is the Policy Director's call and has not been given; see "Remaining" in the brief README. The earlier HOLD banner recorded: (1) the general fund overclaim and (2) the out-of-date range. Both are resolved below. Do not print any earlier copy of this page. What changed, against the red team findings (05-Red-Team-Review.md F-2 and 05-Red-Team-and-Counsel-Review.md F-1, S-1, S-2, S-4, M-5, m-1 -- the two reviews number the general fund finding differently and it is the same finding): F-2 / F-1 (fatal). "General fund cost: $0. That is structural, not a rounding" is REPLACED with "this bill requests no appropriation," and school divisions and local governments are now named as cost-bearers. The package's own who-bears table books the state share as general fund AND nongeneral fund, so the broad claim was refuted by this package's own arithmetic. S-1. The claim that this bill "costs the Fund less per member than the one VRS already scored" is REMOVED. It set a 2.5-year paid purchase against a 4-year free grant. HB 1867 is now cited only for what it is -- evidence that VRS will file a number of its own. S-2. "Below about age 47-48 a veteran pays more than the credit is actuarially worth" is REMOVED. On the full basis used to price this bill there is no such age. Replaced by the plan-mix argument (04 § 2.3), which holds on the same basis the cost is computed on. S-4. "Every veteran in VRS" is REMOVED. § 51.1-142.2 B 3 bars a veteran whose service already counts toward a military retirement, and the population estimate is now labelled a ceiling for that reason. M-5. The amortised employer contribution rate is ADDED in the plain form a fiscal impact statement actually uses. m-1. "Veteran state employees" / "on the state payroll" corrected to state, school division and local. COST FIGURES are the corrected model run of October 25, 2026: - the pool pairing bug is fixed (red team S-3): the eligible pool is a single reconciled 11,565-24,036 and the grid now agrees with the by-plan table; - the floor is taken from the current 10%-30% scenario set, not the retired 5% row (red team S-5). Together those give $28M-$166M, superseding BOTH the published "$13M-$182M" and the "$26M-$182M" interim figure in Annex B A-22. Reproduce with models/fm_model.py, section 3. Files 01, 03 and 04 are being reconciled to this band separately. Superseded and NOT to be quoted from any earlier copy of this page: "under $2 million one time", "under $100,000 a year", "about 5 cents out of every $100", "$13M-$182M", "$26M-$182M", "about 3,400 in the state classified workforce", "General fund cost: $0", "costs the Fund less per member", "below about age 47-48 a veteran pays more than the credit is actuarially worth", "every veteran in VRS", "it stays the same tiny share of payroll".</w:t>
       </w:r>
     </w:p>
     <w:sectPr>

</xml_diff>